<commit_message>
Final Change In code that is like Interpolation
</commit_message>
<xml_diff>
--- a/kcn-torch-master/תיעוד ריצות ומסקנות.docx
+++ b/kcn-torch-master/תיעוד ריצות ומסקנות.docx
@@ -141,7 +141,20 @@
         <w:bidi w:val="0"/>
       </w:pPr>
       <w:r>
-        <w:t>Extent: BoundingBox(left=34.99986111111111, bottom=31.999861111111112, right=36.000138888888884, top=33.00013888888889)</w:t>
+        <w:t xml:space="preserve">Extent: </w:t>
+      </w:r>
+      <w:proofErr w:type="spellStart"/>
+      <w:proofErr w:type="gramStart"/>
+      <w:r>
+        <w:t>BoundingBox</w:t>
+      </w:r>
+      <w:proofErr w:type="spellEnd"/>
+      <w:r>
+        <w:t>(</w:t>
+      </w:r>
+      <w:proofErr w:type="gramEnd"/>
+      <w:r>
+        <w:t>left=34.99986111111111, bottom=31.999861111111112, right=36.000138888888884, top=33.00013888888889)</w:t>
       </w:r>
     </w:p>
     <w:p>
@@ -167,8 +180,13 @@
         </w:rPr>
       </w:pPr>
       <w:r>
-        <w:t>ranges of elevations_cropped</w:t>
-      </w:r>
+        <w:t xml:space="preserve">ranges of </w:t>
+      </w:r>
+      <w:proofErr w:type="spellStart"/>
+      <w:r>
+        <w:t>elevations_cropped</w:t>
+      </w:r>
+      <w:proofErr w:type="spellEnd"/>
       <w:r>
         <w:rPr>
           <w:rFonts w:cs="Arial"/>
@@ -448,12 +466,21 @@
           <w:rtl/>
         </w:rPr>
       </w:pPr>
-      <w:r>
-        <w:rPr>
-          <w:rFonts w:hint="cs"/>
-          <w:rtl/>
-        </w:rPr>
-        <w:t xml:space="preserve">הערכ </w:t>
+      <w:proofErr w:type="spellStart"/>
+      <w:r>
+        <w:rPr>
+          <w:rFonts w:hint="cs"/>
+          <w:rtl/>
+        </w:rPr>
+        <w:t>הערכ</w:t>
+      </w:r>
+      <w:proofErr w:type="spellEnd"/>
+      <w:r>
+        <w:rPr>
+          <w:rFonts w:hint="cs"/>
+          <w:rtl/>
+        </w:rPr>
+        <w:t xml:space="preserve"> </w:t>
       </w:r>
       <w:r>
         <w:rPr>
@@ -552,9 +579,14 @@
           <w:rtl/>
         </w:rPr>
       </w:pPr>
+      <w:proofErr w:type="spellStart"/>
       <w:r>
         <w:lastRenderedPageBreak/>
-        <w:t>keep_n=0.001</w:t>
+        <w:t>keep_n</w:t>
+      </w:r>
+      <w:proofErr w:type="spellEnd"/>
+      <w:r>
+        <w:t>=0.001</w:t>
       </w:r>
       <w:r>
         <w:rPr>
@@ -562,8 +594,13 @@
         </w:rPr>
         <w:br/>
       </w:r>
-      <w:r>
-        <w:t>validation_size=0.2</w:t>
+      <w:proofErr w:type="spellStart"/>
+      <w:r>
+        <w:t>validation_size</w:t>
+      </w:r>
+      <w:proofErr w:type="spellEnd"/>
+      <w:r>
+        <w:t>=0.2</w:t>
       </w:r>
     </w:p>
     <w:p>
@@ -638,7 +675,23 @@
           <w:rFonts w:hint="cs"/>
           <w:rtl/>
         </w:rPr>
-        <w:t xml:space="preserve">המשקולות הטובות ביותר התקבלו באפוק </w:t>
+        <w:t xml:space="preserve">המשקולות הטובות ביותר התקבלו </w:t>
+      </w:r>
+      <w:proofErr w:type="spellStart"/>
+      <w:r>
+        <w:rPr>
+          <w:rFonts w:hint="cs"/>
+          <w:rtl/>
+        </w:rPr>
+        <w:t>באפוק</w:t>
+      </w:r>
+      <w:proofErr w:type="spellEnd"/>
+      <w:r>
+        <w:rPr>
+          <w:rFonts w:hint="cs"/>
+          <w:rtl/>
+        </w:rPr>
+        <w:t xml:space="preserve"> </w:t>
       </w:r>
       <w:r>
         <w:rPr>
@@ -666,7 +719,23 @@
           <w:rFonts w:hint="cs"/>
           <w:rtl/>
         </w:rPr>
-        <w:t xml:space="preserve"> אפוקים:</w:t>
+        <w:t xml:space="preserve"> </w:t>
+      </w:r>
+      <w:proofErr w:type="spellStart"/>
+      <w:r>
+        <w:rPr>
+          <w:rFonts w:hint="cs"/>
+          <w:rtl/>
+        </w:rPr>
+        <w:t>אפוקים</w:t>
+      </w:r>
+      <w:proofErr w:type="spellEnd"/>
+      <w:r>
+        <w:rPr>
+          <w:rFonts w:hint="cs"/>
+          <w:rtl/>
+        </w:rPr>
+        <w:t>:</w:t>
       </w:r>
     </w:p>
     <w:p>
@@ -748,7 +817,23 @@
           <w:rFonts w:hint="cs"/>
           <w:rtl/>
         </w:rPr>
-        <w:t xml:space="preserve"> תכלס לא נראה שבאמת יש פה תהליך אימון משמעותי ויש הטהייה מוזרה בהתחלה.</w:t>
+        <w:t xml:space="preserve"> תכלס לא נראה שבאמת יש פה תהליך אימון משמעותי ויש </w:t>
+      </w:r>
+      <w:proofErr w:type="spellStart"/>
+      <w:r>
+        <w:rPr>
+          <w:rFonts w:hint="cs"/>
+          <w:rtl/>
+        </w:rPr>
+        <w:t>הטהייה</w:t>
+      </w:r>
+      <w:proofErr w:type="spellEnd"/>
+      <w:r>
+        <w:rPr>
+          <w:rFonts w:hint="cs"/>
+          <w:rtl/>
+        </w:rPr>
+        <w:t xml:space="preserve"> מוזרה בהתחלה.</w:t>
       </w:r>
     </w:p>
     <w:p>
@@ -931,7 +1016,23 @@
           <w:rtl/>
         </w:rPr>
         <w:lastRenderedPageBreak/>
-        <w:t>נרמול לשניהם, ולכן מחזירים אותם לערכים שלאחר הנרמולים. מדובר ב</w:t>
+        <w:t xml:space="preserve">נרמול לשניהם, ולכן מחזירים אותם לערכים שלאחר </w:t>
+      </w:r>
+      <w:proofErr w:type="spellStart"/>
+      <w:r>
+        <w:rPr>
+          <w:rFonts w:hint="cs"/>
+          <w:rtl/>
+        </w:rPr>
+        <w:t>הנרמולים</w:t>
+      </w:r>
+      <w:proofErr w:type="spellEnd"/>
+      <w:r>
+        <w:rPr>
+          <w:rFonts w:hint="cs"/>
+          <w:rtl/>
+        </w:rPr>
+        <w:t>. מדובר ב</w:t>
       </w:r>
       <w:r>
         <w:t xml:space="preserve">err </w:t>
@@ -1285,8 +1386,37 @@
         </w:rPr>
       </w:pPr>
       <w:r>
-        <w:t>Early stopping at epoch 23 Test error is 1.0244735479354858 Model: kcn, test error: 1.0244735479354858 can u create val_error vec and train_err_vec</w:t>
-      </w:r>
+        <w:t xml:space="preserve">Early stopping at epoch 23 Test error is 1.0244735479354858 Model: </w:t>
+      </w:r>
+      <w:proofErr w:type="spellStart"/>
+      <w:r>
+        <w:t>kcn</w:t>
+      </w:r>
+      <w:proofErr w:type="spellEnd"/>
+      <w:r>
+        <w:t xml:space="preserve">, test error: 1.0244735479354858 can u create </w:t>
+      </w:r>
+      <w:proofErr w:type="spellStart"/>
+      <w:r>
+        <w:t>val_error</w:t>
+      </w:r>
+      <w:proofErr w:type="spellEnd"/>
+      <w:r>
+        <w:t xml:space="preserve"> </w:t>
+      </w:r>
+      <w:proofErr w:type="spellStart"/>
+      <w:r>
+        <w:t>vec</w:t>
+      </w:r>
+      <w:proofErr w:type="spellEnd"/>
+      <w:r>
+        <w:t xml:space="preserve"> and </w:t>
+      </w:r>
+      <w:proofErr w:type="spellStart"/>
+      <w:r>
+        <w:t>train_err_vec</w:t>
+      </w:r>
+      <w:proofErr w:type="spellEnd"/>
       <w:r>
         <w:rPr>
           <w:rtl/>
@@ -1357,7 +1487,6 @@
     <w:p>
       <w:pPr>
         <w:rPr>
-          <w:rFonts w:hint="cs"/>
           <w:rtl/>
         </w:rPr>
       </w:pPr>
@@ -1381,6 +1510,698 @@
           <w:rtl/>
         </w:rPr>
         <w:t>בעיה...</w:t>
+      </w:r>
+    </w:p>
+    <w:p>
+      <w:pPr>
+        <w:rPr>
+          <w:rFonts w:ascii="Calibri" w:hAnsi="Calibri" w:cs="Calibri"/>
+          <w:b/>
+          <w:bCs/>
+          <w:sz w:val="32"/>
+          <w:szCs w:val="32"/>
+          <w:u w:val="single"/>
+          <w:rtl/>
+        </w:rPr>
+      </w:pPr>
+      <w:r>
+        <w:rPr>
+          <w:rFonts w:ascii="Calibri" w:hAnsi="Calibri" w:cs="Calibri"/>
+          <w:b/>
+          <w:bCs/>
+          <w:sz w:val="32"/>
+          <w:szCs w:val="32"/>
+          <w:u w:val="single"/>
+          <w:rtl/>
+        </w:rPr>
+        <w:lastRenderedPageBreak/>
+        <w:t>תיעוד ריצות מחודש</w:t>
+      </w:r>
+    </w:p>
+    <w:p>
+      <w:pPr>
+        <w:rPr>
+          <w:rFonts w:ascii="Calibri" w:hAnsi="Calibri" w:cs="Calibri"/>
+          <w:b/>
+          <w:bCs/>
+          <w:sz w:val="32"/>
+          <w:szCs w:val="32"/>
+          <w:u w:val="single"/>
+          <w:rtl/>
+        </w:rPr>
+      </w:pPr>
+      <w:r>
+        <w:rPr>
+          <w:rFonts w:ascii="Calibri" w:hAnsi="Calibri" w:cs="Calibri"/>
+          <w:b/>
+          <w:bCs/>
+          <w:sz w:val="32"/>
+          <w:szCs w:val="32"/>
+          <w:u w:val="single"/>
+          <w:rtl/>
+        </w:rPr>
+        <w:t>מסד הנתונים</w:t>
+      </w:r>
+    </w:p>
+    <w:p>
+      <w:pPr>
+        <w:rPr>
+          <w:rFonts w:ascii="Calibri" w:hAnsi="Calibri" w:cs="Calibri"/>
+          <w:b/>
+          <w:bCs/>
+          <w:sz w:val="32"/>
+          <w:szCs w:val="32"/>
+          <w:u w:val="single"/>
+        </w:rPr>
+      </w:pPr>
+      <w:r>
+        <w:rPr>
+          <w:rFonts w:ascii="Calibri" w:hAnsi="Calibri" w:cs="Calibri"/>
+          <w:b/>
+          <w:bCs/>
+          <w:sz w:val="32"/>
+          <w:szCs w:val="32"/>
+          <w:u w:val="single"/>
+        </w:rPr>
+        <w:t>Train Dataset Summary</w:t>
+      </w:r>
+    </w:p>
+    <w:p>
+      <w:pPr>
+        <w:bidi w:val="0"/>
+      </w:pPr>
+      <w:r>
+        <w:t>Train Dataset Summary</w:t>
+      </w:r>
+    </w:p>
+    <w:p>
+      <w:pPr>
+        <w:bidi w:val="0"/>
+      </w:pPr>
+      <w:r>
+        <w:rPr>
+          <w:rFonts w:ascii="Segoe UI Symbol" w:hAnsi="Segoe UI Symbol" w:cs="Segoe UI Symbol"/>
+        </w:rPr>
+        <w:t>➤</w:t>
+      </w:r>
+      <w:r>
+        <w:t xml:space="preserve"> Number of points: 352</w:t>
+      </w:r>
+    </w:p>
+    <w:p>
+      <w:pPr>
+        <w:bidi w:val="0"/>
+      </w:pPr>
+      <w:r>
+        <w:rPr>
+          <w:rFonts w:ascii="Segoe UI Symbol" w:hAnsi="Segoe UI Symbol" w:cs="Segoe UI Symbol"/>
+        </w:rPr>
+        <w:t>➤</w:t>
+      </w:r>
+      <w:r>
+        <w:t xml:space="preserve"> Coords shape: </w:t>
+      </w:r>
+      <w:proofErr w:type="spellStart"/>
+      <w:proofErr w:type="gramStart"/>
+      <w:r>
+        <w:t>torch.Size</w:t>
+      </w:r>
+      <w:proofErr w:type="spellEnd"/>
+      <w:proofErr w:type="gramEnd"/>
+      <w:r>
+        <w:t>([352, 2])</w:t>
+      </w:r>
+    </w:p>
+    <w:p>
+      <w:pPr>
+        <w:bidi w:val="0"/>
+      </w:pPr>
+      <w:r>
+        <w:rPr>
+          <w:rFonts w:ascii="Segoe UI Symbol" w:hAnsi="Segoe UI Symbol" w:cs="Segoe UI Symbol"/>
+        </w:rPr>
+        <w:t>➤</w:t>
+      </w:r>
+      <w:r>
+        <w:t xml:space="preserve"> Feature shape: </w:t>
+      </w:r>
+      <w:proofErr w:type="spellStart"/>
+      <w:proofErr w:type="gramStart"/>
+      <w:r>
+        <w:t>torch.Size</w:t>
+      </w:r>
+      <w:proofErr w:type="spellEnd"/>
+      <w:proofErr w:type="gramEnd"/>
+      <w:r>
+        <w:t>([352, 2])</w:t>
+      </w:r>
+    </w:p>
+    <w:p>
+      <w:pPr>
+        <w:bidi w:val="0"/>
+      </w:pPr>
+      <w:r>
+        <w:rPr>
+          <w:rFonts w:ascii="Segoe UI Symbol" w:hAnsi="Segoe UI Symbol" w:cs="Segoe UI Symbol"/>
+        </w:rPr>
+        <w:t>➤</w:t>
+      </w:r>
+      <w:r>
+        <w:t xml:space="preserve"> Label shape: </w:t>
+      </w:r>
+      <w:proofErr w:type="spellStart"/>
+      <w:proofErr w:type="gramStart"/>
+      <w:r>
+        <w:t>torch.Size</w:t>
+      </w:r>
+      <w:proofErr w:type="spellEnd"/>
+      <w:proofErr w:type="gramEnd"/>
+      <w:r>
+        <w:t>([352, 1])</w:t>
+      </w:r>
+    </w:p>
+    <w:p>
+      <w:pPr>
+        <w:bidi w:val="0"/>
+      </w:pPr>
+      <w:r>
+        <w:rPr>
+          <w:rFonts w:ascii="Segoe UI Symbol" w:hAnsi="Segoe UI Symbol" w:cs="Segoe UI Symbol"/>
+        </w:rPr>
+        <w:t>➤</w:t>
+      </w:r>
+      <w:r>
+        <w:t xml:space="preserve"> Feature mean/std (first 5 dims):</w:t>
+      </w:r>
+    </w:p>
+    <w:p>
+      <w:pPr>
+        <w:bidi w:val="0"/>
+      </w:pPr>
+      <w:r>
+        <w:t xml:space="preserve">   mu = [32.894264 35.109146]</w:t>
+      </w:r>
+    </w:p>
+    <w:p>
+      <w:pPr>
+        <w:bidi w:val="0"/>
+      </w:pPr>
+      <w:r>
+        <w:t xml:space="preserve">  std = [0.05836887 0.</w:t>
+      </w:r>
+      <w:proofErr w:type="gramStart"/>
+      <w:r>
+        <w:t>049546  ]</w:t>
+      </w:r>
+      <w:proofErr w:type="gramEnd"/>
+    </w:p>
+    <w:p>
+      <w:pPr>
+        <w:bidi w:val="0"/>
+      </w:pPr>
+      <w:r>
+        <w:rPr>
+          <w:rFonts w:ascii="Segoe UI Symbol" w:hAnsi="Segoe UI Symbol" w:cs="Segoe UI Symbol"/>
+        </w:rPr>
+        <w:t>➤</w:t>
+      </w:r>
+      <w:r>
+        <w:t xml:space="preserve"> Elevation min/max: -0.71 / 5.68</w:t>
+      </w:r>
+    </w:p>
+    <w:p>
+      <w:pPr>
+        <w:bidi w:val="0"/>
+      </w:pPr>
+      <w:r>
+        <w:rPr>
+          <w:rFonts w:ascii="Segoe UI Symbol" w:hAnsi="Segoe UI Symbol" w:cs="Segoe UI Symbol"/>
+        </w:rPr>
+        <w:t>➤</w:t>
+      </w:r>
+      <w:r>
+        <w:t xml:space="preserve"> Lat range: 32.8008 - 33.0000</w:t>
+      </w:r>
+    </w:p>
+    <w:p>
+      <w:pPr>
+        <w:bidi w:val="0"/>
+      </w:pPr>
+      <w:r>
+        <w:rPr>
+          <w:rFonts w:ascii="Segoe UI Symbol" w:hAnsi="Segoe UI Symbol" w:cs="Segoe UI Symbol"/>
+        </w:rPr>
+        <w:t>➤</w:t>
+      </w:r>
+      <w:r>
+        <w:t xml:space="preserve"> Lon range: 35.0306 - 35.1986</w:t>
+      </w:r>
+    </w:p>
+    <w:p>
+      <w:pPr>
+        <w:bidi w:val="0"/>
+        <w:rPr>
+          <w:rtl/>
+        </w:rPr>
+      </w:pPr>
+    </w:p>
+    <w:p>
+      <w:pPr>
+        <w:bidi w:val="0"/>
+      </w:pPr>
+      <w:r>
+        <w:t xml:space="preserve"> Test Dataset Summary</w:t>
+      </w:r>
+    </w:p>
+    <w:p>
+      <w:pPr>
+        <w:bidi w:val="0"/>
+      </w:pPr>
+      <w:r>
+        <w:rPr>
+          <w:rFonts w:ascii="Segoe UI Symbol" w:hAnsi="Segoe UI Symbol" w:cs="Segoe UI Symbol"/>
+        </w:rPr>
+        <w:t>➤</w:t>
+      </w:r>
+      <w:r>
+        <w:t xml:space="preserve"> Number of points: 110</w:t>
+      </w:r>
+    </w:p>
+    <w:p>
+      <w:pPr>
+        <w:bidi w:val="0"/>
+      </w:pPr>
+      <w:r>
+        <w:rPr>
+          <w:rFonts w:ascii="Segoe UI Symbol" w:hAnsi="Segoe UI Symbol" w:cs="Segoe UI Symbol"/>
+        </w:rPr>
+        <w:t>➤</w:t>
+      </w:r>
+      <w:r>
+        <w:t xml:space="preserve"> Coords shape: </w:t>
+      </w:r>
+      <w:proofErr w:type="spellStart"/>
+      <w:proofErr w:type="gramStart"/>
+      <w:r>
+        <w:t>torch.Size</w:t>
+      </w:r>
+      <w:proofErr w:type="spellEnd"/>
+      <w:proofErr w:type="gramEnd"/>
+      <w:r>
+        <w:t>([110, 2])</w:t>
+      </w:r>
+    </w:p>
+    <w:p>
+      <w:pPr>
+        <w:bidi w:val="0"/>
+      </w:pPr>
+      <w:r>
+        <w:rPr>
+          <w:rFonts w:ascii="Segoe UI Symbol" w:hAnsi="Segoe UI Symbol" w:cs="Segoe UI Symbol"/>
+        </w:rPr>
+        <w:t>➤</w:t>
+      </w:r>
+      <w:r>
+        <w:t xml:space="preserve"> Feature shape: </w:t>
+      </w:r>
+      <w:proofErr w:type="spellStart"/>
+      <w:proofErr w:type="gramStart"/>
+      <w:r>
+        <w:t>torch.Size</w:t>
+      </w:r>
+      <w:proofErr w:type="spellEnd"/>
+      <w:proofErr w:type="gramEnd"/>
+      <w:r>
+        <w:t>([110, 2])</w:t>
+      </w:r>
+    </w:p>
+    <w:p>
+      <w:pPr>
+        <w:bidi w:val="0"/>
+      </w:pPr>
+      <w:r>
+        <w:rPr>
+          <w:rFonts w:ascii="Segoe UI Symbol" w:hAnsi="Segoe UI Symbol" w:cs="Segoe UI Symbol"/>
+        </w:rPr>
+        <w:t>➤</w:t>
+      </w:r>
+      <w:r>
+        <w:t xml:space="preserve"> Label shape: </w:t>
+      </w:r>
+      <w:proofErr w:type="spellStart"/>
+      <w:proofErr w:type="gramStart"/>
+      <w:r>
+        <w:t>torch.Size</w:t>
+      </w:r>
+      <w:proofErr w:type="spellEnd"/>
+      <w:proofErr w:type="gramEnd"/>
+      <w:r>
+        <w:t>([110, 1])</w:t>
+      </w:r>
+    </w:p>
+    <w:p>
+      <w:pPr>
+        <w:bidi w:val="0"/>
+      </w:pPr>
+      <w:r>
+        <w:rPr>
+          <w:rFonts w:ascii="Segoe UI Symbol" w:hAnsi="Segoe UI Symbol" w:cs="Segoe UI Symbol"/>
+        </w:rPr>
+        <w:t>➤</w:t>
+      </w:r>
+      <w:r>
+        <w:t xml:space="preserve"> Feature mean/std (first 5 dims):</w:t>
+      </w:r>
+    </w:p>
+    <w:p>
+      <w:pPr>
+        <w:bidi w:val="0"/>
+      </w:pPr>
+      <w:r>
+        <w:t xml:space="preserve">   mu = [</w:t>
+      </w:r>
+      <w:proofErr w:type="gramStart"/>
+      <w:r>
+        <w:t>32.88919  35.113667</w:t>
+      </w:r>
+      <w:proofErr w:type="gramEnd"/>
+      <w:r>
+        <w:t>]</w:t>
+      </w:r>
+    </w:p>
+    <w:p>
+      <w:pPr>
+        <w:bidi w:val="0"/>
+      </w:pPr>
+      <w:r>
+        <w:t xml:space="preserve">  std = [0.06168272 0.05210439]</w:t>
+      </w:r>
+    </w:p>
+    <w:p>
+      <w:pPr>
+        <w:bidi w:val="0"/>
+      </w:pPr>
+      <w:r>
+        <w:rPr>
+          <w:rFonts w:ascii="Segoe UI Symbol" w:hAnsi="Segoe UI Symbol" w:cs="Segoe UI Symbol"/>
+        </w:rPr>
+        <w:t>➤</w:t>
+      </w:r>
+      <w:r>
+        <w:t xml:space="preserve"> Elevation min/max: -0.69 / 4.22</w:t>
+      </w:r>
+    </w:p>
+    <w:p>
+      <w:pPr>
+        <w:bidi w:val="0"/>
+      </w:pPr>
+      <w:r>
+        <w:rPr>
+          <w:rFonts w:ascii="Segoe UI Symbol" w:hAnsi="Segoe UI Symbol" w:cs="Segoe UI Symbol"/>
+        </w:rPr>
+        <w:t>➤</w:t>
+      </w:r>
+      <w:r>
+        <w:t xml:space="preserve"> Lat range: 32.8008 - 33.0000</w:t>
+      </w:r>
+    </w:p>
+    <w:p>
+      <w:pPr>
+        <w:bidi w:val="0"/>
+      </w:pPr>
+      <w:r>
+        <w:rPr>
+          <w:rFonts w:ascii="Segoe UI Symbol" w:hAnsi="Segoe UI Symbol" w:cs="Segoe UI Symbol"/>
+        </w:rPr>
+        <w:t>➤</w:t>
+      </w:r>
+      <w:r>
+        <w:t xml:space="preserve"> Lon range: 35.0300 - 35.1983</w:t>
+      </w:r>
+    </w:p>
+    <w:p>
+      <w:pPr>
+        <w:bidi w:val="0"/>
+      </w:pPr>
+    </w:p>
+    <w:p>
+      <w:pPr>
+        <w:bidi w:val="0"/>
+        <w:rPr>
+          <w:rtl/>
+        </w:rPr>
+      </w:pPr>
+      <w:r>
+        <w:rPr>
+          <w:rFonts w:hint="cs"/>
+          <w:rtl/>
+        </w:rPr>
+        <w:t>כשאין תהליך למידה"</w:t>
+      </w:r>
+      <w:r>
+        <w:rPr>
+          <w:rtl/>
+        </w:rPr>
+        <w:br/>
+      </w:r>
+    </w:p>
+    <w:p>
+      <w:pPr>
+        <w:bidi w:val="0"/>
+      </w:pPr>
+      <w:r>
+        <w:t>Early stopping at epoch 27</w:t>
+      </w:r>
+    </w:p>
+    <w:p>
+      <w:pPr>
+        <w:bidi w:val="0"/>
+      </w:pPr>
+      <w:r>
+        <w:t>Test loss is 1.209233283996582</w:t>
+      </w:r>
+    </w:p>
+    <w:p>
+      <w:pPr>
+        <w:bidi w:val="0"/>
+      </w:pPr>
+      <w:r>
+        <w:t>Test MSE is 659.4434814453125</w:t>
+      </w:r>
+    </w:p>
+    <w:p>
+      <w:pPr>
+        <w:bidi w:val="0"/>
+      </w:pPr>
+      <w:r>
+        <w:t>Test MAP is 23.372180938720703</w:t>
+      </w:r>
+    </w:p>
+    <w:p>
+      <w:pPr>
+        <w:bidi w:val="0"/>
+        <w:rPr>
+          <w:rtl/>
+        </w:rPr>
+      </w:pPr>
+      <w:r>
+        <w:t>Test Mean error is -19.05357551574707, Test STD error is 17.21640968322754</w:t>
+      </w:r>
+    </w:p>
+    <w:p>
+      <w:pPr>
+        <w:bidi w:val="0"/>
+        <w:rPr>
+          <w:rtl/>
+        </w:rPr>
+      </w:pPr>
+    </w:p>
+    <w:p>
+      <w:pPr>
+        <w:bidi w:val="0"/>
+      </w:pPr>
+      <w:r>
+        <w:rPr>
+          <w:rFonts w:hint="cs"/>
+          <w:rtl/>
+        </w:rPr>
+        <w:t>כשיש תהליך למידה:</w:t>
+      </w:r>
+      <w:r>
+        <w:rPr>
+          <w:rtl/>
+        </w:rPr>
+        <w:br/>
+      </w:r>
+      <w:r>
+        <w:t>Early stopping at epoch 25</w:t>
+      </w:r>
+    </w:p>
+    <w:p>
+      <w:pPr>
+        <w:bidi w:val="0"/>
+      </w:pPr>
+      <w:r>
+        <w:t>Test loss is 0.23048196732997894</w:t>
+      </w:r>
+    </w:p>
+    <w:p>
+      <w:pPr>
+        <w:bidi w:val="0"/>
+      </w:pPr>
+      <w:r>
+        <w:t>Test MSE is 1906.2232666015625</w:t>
+      </w:r>
+    </w:p>
+    <w:p>
+      <w:pPr>
+        <w:bidi w:val="0"/>
+      </w:pPr>
+      <w:r>
+        <w:t>Test MAP is 29.608930587768555</w:t>
+      </w:r>
+    </w:p>
+    <w:p>
+      <w:pPr>
+        <w:bidi w:val="0"/>
+      </w:pPr>
+      <w:r>
+        <w:t>Test Mean error is -29.608930587768555, Test STD error is 32.086360931396484</w:t>
+      </w:r>
+    </w:p>
+    <w:p>
+      <w:pPr>
+        <w:bidi w:val="0"/>
+      </w:pPr>
+      <w:r>
+        <w:rPr>
+          <w:rFonts w:hint="cs"/>
+          <w:rtl/>
+        </w:rPr>
+        <w:t xml:space="preserve">עם מטריצת </w:t>
+      </w:r>
+      <w:r>
+        <w:t>Attention</w:t>
+      </w:r>
+    </w:p>
+    <w:p>
+      <w:pPr>
+        <w:bidi w:val="0"/>
+      </w:pPr>
+      <w:r>
+        <w:t>Early stopping at epoch 21</w:t>
+      </w:r>
+    </w:p>
+    <w:p>
+      <w:pPr>
+        <w:bidi w:val="0"/>
+      </w:pPr>
+      <w:proofErr w:type="gramStart"/>
+      <w:r>
+        <w:t>Test</w:t>
+      </w:r>
+      <w:proofErr w:type="gramEnd"/>
+      <w:r>
+        <w:t xml:space="preserve"> loss is 0.07655936479568481</w:t>
+      </w:r>
+    </w:p>
+    <w:p>
+      <w:pPr>
+        <w:bidi w:val="0"/>
+      </w:pPr>
+      <w:r>
+        <w:t>Test MSE is 3264.107421875</w:t>
+      </w:r>
+    </w:p>
+    <w:p>
+      <w:pPr>
+        <w:bidi w:val="0"/>
+      </w:pPr>
+      <w:r>
+        <w:t>Test MAP is 32.659645080566406</w:t>
+      </w:r>
+    </w:p>
+    <w:p>
+      <w:pPr>
+        <w:bidi w:val="0"/>
+      </w:pPr>
+      <w:r>
+        <w:t>Test Mean error is -32.659645080566406, Test STD error is 46.87702178955078</w:t>
+      </w:r>
+    </w:p>
+    <w:p>
+      <w:pPr>
+        <w:bidi w:val="0"/>
+        <w:rPr>
+          <w:b/>
+          <w:bCs/>
+        </w:rPr>
+      </w:pPr>
+    </w:p>
+    <w:p>
+      <w:pPr>
+        <w:bidi w:val="0"/>
+        <w:rPr>
+          <w:b/>
+          <w:bCs/>
+        </w:rPr>
+      </w:pPr>
+      <w:r>
+        <w:rPr>
+          <w:b/>
+          <w:bCs/>
+        </w:rPr>
+        <w:t>Test loss is 0.09396129101514816</w:t>
+      </w:r>
+    </w:p>
+    <w:p>
+      <w:pPr>
+        <w:bidi w:val="0"/>
+        <w:rPr>
+          <w:b/>
+          <w:bCs/>
+        </w:rPr>
+      </w:pPr>
+      <w:r>
+        <w:rPr>
+          <w:b/>
+          <w:bCs/>
+        </w:rPr>
+        <w:t>Test MSE is 170.26300048828125</w:t>
+      </w:r>
+    </w:p>
+    <w:p>
+      <w:pPr>
+        <w:bidi w:val="0"/>
+        <w:rPr>
+          <w:b/>
+          <w:bCs/>
+        </w:rPr>
+      </w:pPr>
+      <w:r>
+        <w:rPr>
+          <w:b/>
+          <w:bCs/>
+        </w:rPr>
+        <w:t>Test MAP is 7.993255138397217</w:t>
+      </w:r>
+    </w:p>
+    <w:p>
+      <w:pPr>
+        <w:bidi w:val="0"/>
+        <w:rPr>
+          <w:rFonts w:hint="cs"/>
+          <w:b/>
+          <w:bCs/>
+          <w:rtl/>
+        </w:rPr>
+      </w:pPr>
+      <w:r>
+        <w:rPr>
+          <w:b/>
+          <w:bCs/>
+        </w:rPr>
+        <w:t>Test Mean error is 3.938890218734741, Test STD error is 12.439780235290527</w:t>
       </w:r>
     </w:p>
     <w:sectPr>
@@ -2851,6 +3672,7 @@
   <w:style w:type="character" w:default="1" w:styleId="DefaultParagraphFont">
     <w:name w:val="Default Paragraph Font"/>
     <w:uiPriority w:val="1"/>
+    <w:semiHidden/>
     <w:unhideWhenUsed/>
   </w:style>
   <w:style w:type="table" w:default="1" w:styleId="TableNormal">

</xml_diff>